<commit_message>
Add cable and combined cycle design manuals to consolidated reference
Co-Authored-By: Claude Opus 5.5 <noreply@anthropic.com>
Claude-Session: https://claude.ai/code/session_019FAorQqMCvP9b8FQJACyKw
</commit_message>
<xml_diff>
--- a/docs/cable_requirements_consolidated.docx
+++ b/docs/cable_requirements_consolidated.docx
@@ -2,7 +2,7 @@
 <file path=word/document.xml><?xml version="1.0" encoding="utf-8"?>
 <w:document xmlns:w="http://schemas.openxmlformats.org/wordprocessingml/2006/main" xmlns:m="http://schemas.openxmlformats.org/officeDocument/2006/math" xmlns:r="http://schemas.openxmlformats.org/officeDocument/2006/relationships" xmlns:o="urn:schemas-microsoft-com:office:office" xmlns:v="urn:schemas-microsoft-com:vml" xmlns:w10="urn:schemas-microsoft-com:office:word" xmlns:a="http://schemas.openxmlformats.org/drawingml/2006/main" xmlns:pic="http://schemas.openxmlformats.org/drawingml/2006/picture" xmlns:wp="http://schemas.openxmlformats.org/drawingml/2006/wordprocessingDrawing">
   <w:body>
-    <w:bookmarkStart w:id="76" w:name="Xf7c5ebe1f4ae05ba54857166fc2e87cd881d35c"/>
+    <w:bookmarkStart w:id="92" w:name="Xf7c5ebe1f4ae05ba54857166fc2e87cd881d35c"/>
     <w:p>
       <w:pPr>
         <w:pStyle w:val="Heading1"/>
@@ -16,7 +16,7 @@
         <w:pStyle w:val="FirstParagraph"/>
       </w:pPr>
       <w:r>
-        <w:t xml:space="preserve">Oct 18, 2026 · Stephan</w:t>
+        <w:t xml:space="preserve">Oct 19, 2026 · Stephan</w:t>
       </w:r>
     </w:p>
     <w:bookmarkStart w:id="20" w:name="purpose-and-scope"/>
@@ -376,6 +376,7 @@
     </w:p>
     <w:tbl>
       <w:tblPr>
+        <w:tblStyle w:val="Table"/>
         <w:tblW w:type="auto" w:w="0"/>
         <w:tblLook w:firstRow="1" w:lastRow="0" w:firstColumn="0" w:lastColumn="0" w:noHBand="0" w:noVBand="0" w:val="0020"/>
         <w:jc w:val="start"/>
@@ -601,6 +602,7 @@
     </w:p>
     <w:tbl>
       <w:tblPr>
+        <w:tblStyle w:val="Table"/>
         <w:tblW w:type="auto" w:w="0"/>
         <w:tblLook w:firstRow="1" w:lastRow="0" w:firstColumn="0" w:lastColumn="0" w:noHBand="0" w:noVBand="0" w:val="0020"/>
         <w:jc w:val="start"/>
@@ -811,6 +813,7 @@
     </w:p>
     <w:tbl>
       <w:tblPr>
+        <w:tblStyle w:val="Table"/>
         <w:tblW w:type="auto" w:w="0"/>
         <w:tblLook w:firstRow="1" w:lastRow="0" w:firstColumn="0" w:lastColumn="0" w:noHBand="0" w:noVBand="0" w:val="0020"/>
         <w:jc w:val="start"/>
@@ -2122,6 +2125,7 @@
     </w:p>
     <w:tbl>
       <w:tblPr>
+        <w:tblStyle w:val="Table"/>
         <w:tblW w:type="auto" w:w="0"/>
         <w:tblLook w:firstRow="1" w:lastRow="0" w:firstColumn="0" w:lastColumn="0" w:noHBand="0" w:noVBand="0" w:val="0020"/>
         <w:jc w:val="start"/>
@@ -2456,6 +2460,7 @@
     </w:p>
     <w:tbl>
       <w:tblPr>
+        <w:tblStyle w:val="Table"/>
         <w:tblW w:type="auto" w:w="0"/>
         <w:tblLook w:firstRow="1" w:lastRow="0" w:firstColumn="0" w:lastColumn="0" w:noHBand="0" w:noVBand="0" w:val="0020"/>
         <w:jc w:val="start"/>
@@ -3106,6 +3111,7 @@
     </w:p>
     <w:tbl>
       <w:tblPr>
+        <w:tblStyle w:val="Table"/>
         <w:tblW w:type="auto" w:w="0"/>
         <w:tblLook w:firstRow="1" w:lastRow="0" w:firstColumn="0" w:lastColumn="0" w:noHBand="0" w:noVBand="0" w:val="0020"/>
         <w:jc w:val="start"/>
@@ -3548,6 +3554,7 @@
     </w:p>
     <w:tbl>
       <w:tblPr>
+        <w:tblStyle w:val="Table"/>
         <w:tblW w:type="auto" w:w="0"/>
         <w:tblLook w:firstRow="1" w:lastRow="0" w:firstColumn="0" w:lastColumn="0" w:noHBand="0" w:noVBand="0" w:val="0020"/>
         <w:jc w:val="start"/>
@@ -3941,6 +3948,7 @@
     </w:p>
     <w:tbl>
       <w:tblPr>
+        <w:tblStyle w:val="Table"/>
         <w:tblW w:type="auto" w:w="0"/>
         <w:tblLook w:firstRow="1" w:lastRow="0" w:firstColumn="0" w:lastColumn="0" w:noHBand="0" w:noVBand="0" w:val="0020"/>
         <w:jc w:val="start"/>
@@ -4772,6 +4780,7 @@
     </w:p>
     <w:tbl>
       <w:tblPr>
+        <w:tblStyle w:val="Table"/>
         <w:tblW w:type="auto" w:w="0"/>
         <w:tblLook w:firstRow="1" w:lastRow="0" w:firstColumn="0" w:lastColumn="0" w:noHBand="0" w:noVBand="0" w:val="0020"/>
         <w:jc w:val="start"/>
@@ -5312,6 +5321,7 @@
     </w:p>
     <w:tbl>
       <w:tblPr>
+        <w:tblStyle w:val="Table"/>
         <w:tblW w:type="auto" w:w="0"/>
         <w:tblLook w:firstRow="1" w:lastRow="0" w:firstColumn="0" w:lastColumn="0" w:noHBand="0" w:noVBand="0" w:val="0020"/>
         <w:jc w:val="start"/>
@@ -6405,7 +6415,1036 @@
       </w:r>
     </w:p>
     <w:bookmarkEnd w:id="74"/>
-    <w:bookmarkStart w:id="75" w:name="sources"/>
+    <w:bookmarkStart w:id="90" w:name="Xcbf01670b1c3a24f922f3f40a4a97f7d4eb3216"/>
+    <w:p>
+      <w:pPr>
+        <w:pStyle w:val="Heading2"/>
+      </w:pPr>
+      <w:r>
+        <w:t xml:space="preserve">Sources: power cable and combined cycle design manuals</w:t>
+      </w:r>
+    </w:p>
+    <w:p>
+      <w:pPr>
+        <w:pStyle w:val="FirstParagraph"/>
+      </w:pPr>
+      <w:r>
+        <w:t xml:space="preserve">For real cable data, the most useful manual is the Okonite 2025 Engineering Data handbook. For a 3x1 configuration, it is GE's GER-3574G. These were found by search and not opened; the hosts are blocked in this environment.</w:t>
+      </w:r>
+    </w:p>
+    <w:p>
+      <w:pPr>
+        <w:pStyle w:val="BodyText"/>
+      </w:pPr>
+      <w:r>
+        <w:rPr>
+          <w:bCs/>
+          <w:b/>
+        </w:rPr>
+        <w:t xml:space="preserve">Power cable manuals</w:t>
+      </w:r>
+    </w:p>
+    <w:tbl>
+      <w:tblPr>
+        <w:tblStyle w:val="Table"/>
+        <w:tblW w:type="auto" w:w="0"/>
+        <w:tblLook w:firstRow="1" w:lastRow="0" w:firstColumn="0" w:lastColumn="0" w:noHBand="0" w:noVBand="0" w:val="0020"/>
+        <w:jc w:val="start"/>
+        <w:tblBorders>
+          <w:top w:val="single" w:sz="4" w:color="BFBFBF"/>
+          <w:left w:val="single" w:sz="4" w:color="BFBFBF"/>
+          <w:bottom w:val="single" w:sz="4" w:color="BFBFBF"/>
+          <w:right w:val="single" w:sz="4" w:color="BFBFBF"/>
+          <w:insideH w:val="single" w:sz="4" w:color="BFBFBF"/>
+          <w:insideV w:val="single" w:sz="4" w:color="BFBFBF"/>
+        </w:tblBorders>
+      </w:tblPr>
+      <w:tblGrid>
+        <w:gridCol w:w="2640"/>
+        <w:gridCol w:w="2640"/>
+        <w:gridCol w:w="2640"/>
+      </w:tblGrid>
+      <w:tr>
+        <w:trPr>
+          <w:tblHeader w:val="true"/>
+        </w:trPr>
+        <w:tc>
+          <w:tcPr/>
+          <w:p>
+            <w:pPr>
+              <w:pStyle w:val="Compact"/>
+              <w:jc w:val="left"/>
+            </w:pPr>
+            <w:r>
+              <w:rPr>
+                <w:b/>
+                <w:sz w:val="17"/>
+              </w:rPr>
+              <w:t xml:space="preserve">Manual</w:t>
+            </w:r>
+          </w:p>
+        </w:tc>
+        <w:tc>
+          <w:tcPr/>
+          <w:p>
+            <w:pPr>
+              <w:pStyle w:val="Compact"/>
+              <w:jc w:val="left"/>
+            </w:pPr>
+            <w:r>
+              <w:rPr>
+                <w:b/>
+                <w:sz w:val="17"/>
+              </w:rPr>
+              <w:t xml:space="preserve">Use it for</w:t>
+            </w:r>
+          </w:p>
+        </w:tc>
+        <w:tc>
+          <w:tcPr/>
+          <w:p>
+            <w:pPr>
+              <w:pStyle w:val="Compact"/>
+              <w:jc w:val="left"/>
+            </w:pPr>
+            <w:r>
+              <w:rPr>
+                <w:b/>
+                <w:sz w:val="17"/>
+              </w:rPr>
+              <w:t xml:space="preserve">Access</w:t>
+            </w:r>
+          </w:p>
+        </w:tc>
+      </w:tr>
+      <w:tr>
+        <w:tc>
+          <w:tcPr/>
+          <w:p>
+            <w:pPr>
+              <w:pStyle w:val="Compact"/>
+              <w:jc w:val="left"/>
+            </w:pPr>
+            <w:hyperlink r:id="rId75">
+              <w:r>
+                <w:rPr>
+                  <w:rStyle w:val="Hyperlink"/>
+                </w:rPr>
+                <w:t xml:space="preserve">Okonite, Engineering Data for Copper and Aluminum Conductor Electrical Cables (2025)</w:t>
+              </w:r>
+            </w:hyperlink>
+          </w:p>
+        </w:tc>
+        <w:tc>
+          <w:tcPr/>
+          <w:p>
+            <w:pPr>
+              <w:pStyle w:val="Compact"/>
+              <w:jc w:val="left"/>
+            </w:pPr>
+            <w:r>
+              <w:rPr>
+                <w:sz w:val="17"/>
+              </w:rPr>
+              <w:t xml:space="preserve">Conductor resistance, shielding, short-circuit currents, ampacity tables. Replaces typical values in the Cable Types sheet.</w:t>
+            </w:r>
+          </w:p>
+        </w:tc>
+        <w:tc>
+          <w:tcPr/>
+          <w:p>
+            <w:pPr>
+              <w:pStyle w:val="Compact"/>
+              <w:jc w:val="left"/>
+            </w:pPr>
+            <w:r>
+              <w:rPr>
+                <w:sz w:val="17"/>
+              </w:rPr>
+              <w:t xml:space="preserve">Free PDF</w:t>
+            </w:r>
+          </w:p>
+        </w:tc>
+      </w:tr>
+      <w:tr>
+        <w:tc>
+          <w:tcPr/>
+          <w:p>
+            <w:pPr>
+              <w:pStyle w:val="Compact"/>
+              <w:jc w:val="left"/>
+            </w:pPr>
+            <w:hyperlink r:id="rId76">
+              <w:r>
+                <w:rPr>
+                  <w:rStyle w:val="Hyperlink"/>
+                </w:rPr>
+                <w:t xml:space="preserve">Okonite stock catalog (2024)</w:t>
+              </w:r>
+            </w:hyperlink>
+          </w:p>
+        </w:tc>
+        <w:tc>
+          <w:tcPr/>
+          <w:p>
+            <w:pPr>
+              <w:pStyle w:val="Compact"/>
+              <w:jc w:val="left"/>
+            </w:pPr>
+            <w:r>
+              <w:rPr>
+                <w:sz w:val="17"/>
+              </w:rPr>
+              <w:t xml:space="preserve">MV and LV cable data sheets, 2.4 kV and above.</w:t>
+            </w:r>
+          </w:p>
+        </w:tc>
+        <w:tc>
+          <w:tcPr/>
+          <w:p>
+            <w:pPr>
+              <w:pStyle w:val="Compact"/>
+              <w:jc w:val="left"/>
+            </w:pPr>
+            <w:r>
+              <w:rPr>
+                <w:sz w:val="17"/>
+              </w:rPr>
+              <w:t xml:space="preserve">Free PDF</w:t>
+            </w:r>
+          </w:p>
+        </w:tc>
+      </w:tr>
+      <w:tr>
+        <w:tc>
+          <w:tcPr/>
+          <w:p>
+            <w:pPr>
+              <w:pStyle w:val="Compact"/>
+              <w:jc w:val="left"/>
+            </w:pPr>
+            <w:hyperlink r:id="rId77">
+              <w:r>
+                <w:rPr>
+                  <w:rStyle w:val="Hyperlink"/>
+                </w:rPr>
+                <w:t xml:space="preserve">Southwire Power Cable Manual</w:t>
+              </w:r>
+            </w:hyperlink>
+          </w:p>
+        </w:tc>
+        <w:tc>
+          <w:tcPr/>
+          <w:p>
+            <w:pPr>
+              <w:pStyle w:val="Compact"/>
+              <w:jc w:val="left"/>
+            </w:pPr>
+            <w:r>
+              <w:rPr>
+                <w:sz w:val="17"/>
+              </w:rPr>
+              <w:t xml:space="preserve">Engineering and installation of extruded-dielectric power cable; general guidance.</w:t>
+            </w:r>
+          </w:p>
+        </w:tc>
+        <w:tc>
+          <w:tcPr/>
+          <w:p>
+            <w:pPr>
+              <w:pStyle w:val="Compact"/>
+              <w:jc w:val="left"/>
+            </w:pPr>
+            <w:r>
+              <w:rPr>
+                <w:sz w:val="17"/>
+              </w:rPr>
+              <w:t xml:space="preserve">Hard-bound book</w:t>
+            </w:r>
+          </w:p>
+        </w:tc>
+      </w:tr>
+      <w:tr>
+        <w:tc>
+          <w:tcPr/>
+          <w:p>
+            <w:pPr>
+              <w:pStyle w:val="Compact"/>
+              <w:jc w:val="left"/>
+            </w:pPr>
+            <w:hyperlink r:id="rId77">
+              <w:r>
+                <w:rPr>
+                  <w:rStyle w:val="Hyperlink"/>
+                </w:rPr>
+                <w:t xml:space="preserve">Southwire Power Cable Installation Guide</w:t>
+              </w:r>
+            </w:hyperlink>
+          </w:p>
+        </w:tc>
+        <w:tc>
+          <w:tcPr/>
+          <w:p>
+            <w:pPr>
+              <w:pStyle w:val="Compact"/>
+              <w:jc w:val="left"/>
+            </w:pPr>
+            <w:r>
+              <w:rPr>
+                <w:sz w:val="17"/>
+              </w:rPr>
+              <w:t xml:space="preserve">#14 AWG to 1000 kcmil, 600 V to 35 kV: allowable pulling tension, sidewall pressure, pulling equations for conduit and tray.</w:t>
+            </w:r>
+          </w:p>
+        </w:tc>
+        <w:tc>
+          <w:tcPr/>
+          <w:p>
+            <w:pPr>
+              <w:pStyle w:val="Compact"/>
+              <w:jc w:val="left"/>
+            </w:pPr>
+            <w:r>
+              <w:rPr>
+                <w:sz w:val="17"/>
+              </w:rPr>
+              <w:t xml:space="preserve">Southwire site</w:t>
+            </w:r>
+          </w:p>
+        </w:tc>
+      </w:tr>
+      <w:tr>
+        <w:tc>
+          <w:tcPr/>
+          <w:p>
+            <w:pPr>
+              <w:pStyle w:val="Compact"/>
+              <w:jc w:val="left"/>
+            </w:pPr>
+            <w:hyperlink r:id="rId78">
+              <w:r>
+                <w:rPr>
+                  <w:rStyle w:val="Hyperlink"/>
+                </w:rPr>
+                <w:t xml:space="preserve">Thue, Electrical Power Cable Engineering, 3rd ed. (CRC, 2017)</w:t>
+              </w:r>
+            </w:hyperlink>
+          </w:p>
+        </w:tc>
+        <w:tc>
+          <w:tcPr/>
+          <w:p>
+            <w:pPr>
+              <w:pStyle w:val="Compact"/>
+              <w:jc w:val="left"/>
+            </w:pPr>
+            <w:r>
+              <w:rPr>
+                <w:sz w:val="17"/>
+              </w:rPr>
+              <w:t xml:space="preserve">Cable design, ampacity, voltage regulation, short circuit, field testing of shielded cable.</w:t>
+            </w:r>
+          </w:p>
+        </w:tc>
+        <w:tc>
+          <w:tcPr/>
+          <w:p>
+            <w:pPr>
+              <w:pStyle w:val="Compact"/>
+              <w:jc w:val="left"/>
+            </w:pPr>
+            <w:r>
+              <w:rPr>
+                <w:sz w:val="17"/>
+              </w:rPr>
+              <w:t xml:space="preserve">Book</w:t>
+            </w:r>
+          </w:p>
+        </w:tc>
+      </w:tr>
+      <w:tr>
+        <w:tc>
+          <w:tcPr/>
+          <w:p>
+            <w:pPr>
+              <w:pStyle w:val="Compact"/>
+              <w:jc w:val="left"/>
+            </w:pPr>
+            <w:hyperlink r:id="rId79">
+              <w:r>
+                <w:rPr>
+                  <w:rStyle w:val="Hyperlink"/>
+                </w:rPr>
+                <w:t xml:space="preserve">Power Cable Engineering with HP-41 Programs</w:t>
+              </w:r>
+            </w:hyperlink>
+          </w:p>
+        </w:tc>
+        <w:tc>
+          <w:tcPr/>
+          <w:p>
+            <w:pPr>
+              <w:pStyle w:val="Compact"/>
+              <w:jc w:val="left"/>
+            </w:pPr>
+            <w:r>
+              <w:rPr>
+                <w:sz w:val="17"/>
+              </w:rPr>
+              <w:t xml:space="preserve">Worked Neher-McGrath ampacity and short-circuit ratings for conductors and shields.</w:t>
+            </w:r>
+          </w:p>
+        </w:tc>
+        <w:tc>
+          <w:tcPr/>
+          <w:p>
+            <w:pPr>
+              <w:pStyle w:val="Compact"/>
+              <w:jc w:val="left"/>
+            </w:pPr>
+            <w:r>
+              <w:rPr>
+                <w:sz w:val="17"/>
+              </w:rPr>
+              <w:t xml:space="preserve">Free PDF</w:t>
+            </w:r>
+          </w:p>
+        </w:tc>
+      </w:tr>
+      <w:tr>
+        <w:tc>
+          <w:tcPr/>
+          <w:p>
+            <w:pPr>
+              <w:pStyle w:val="Compact"/>
+              <w:jc w:val="left"/>
+            </w:pPr>
+            <w:hyperlink r:id="rId80">
+              <w:r>
+                <w:rPr>
+                  <w:rStyle w:val="Hyperlink"/>
+                </w:rPr>
+                <w:t xml:space="preserve">NRC cable design guide ML20065G719</w:t>
+              </w:r>
+            </w:hyperlink>
+          </w:p>
+        </w:tc>
+        <w:tc>
+          <w:tcPr/>
+          <w:p>
+            <w:pPr>
+              <w:pStyle w:val="Compact"/>
+              <w:jc w:val="left"/>
+            </w:pPr>
+            <w:r>
+              <w:rPr>
+                <w:sz w:val="17"/>
+              </w:rPr>
+              <w:t xml:space="preserve">Ampacity, voltage regulation and short-circuit capacity checked separately; derating for bundled circuits.</w:t>
+            </w:r>
+          </w:p>
+        </w:tc>
+        <w:tc>
+          <w:tcPr/>
+          <w:p>
+            <w:pPr>
+              <w:pStyle w:val="Compact"/>
+              <w:jc w:val="left"/>
+            </w:pPr>
+            <w:r>
+              <w:rPr>
+                <w:sz w:val="17"/>
+              </w:rPr>
+              <w:t xml:space="preserve">Free PDF</w:t>
+            </w:r>
+          </w:p>
+        </w:tc>
+      </w:tr>
+    </w:tbl>
+    <w:p>
+      <w:pPr>
+        <w:pStyle w:val="BodyText"/>
+      </w:pPr>
+      <w:r>
+        <w:rPr>
+          <w:bCs/>
+          <w:b/>
+        </w:rPr>
+        <w:t xml:space="preserve">Combined cycle and power plant design manuals</w:t>
+      </w:r>
+    </w:p>
+    <w:tbl>
+      <w:tblPr>
+        <w:tblStyle w:val="Table"/>
+        <w:tblW w:type="auto" w:w="0"/>
+        <w:tblLook w:firstRow="1" w:lastRow="0" w:firstColumn="0" w:lastColumn="0" w:noHBand="0" w:noVBand="0" w:val="0020"/>
+        <w:jc w:val="start"/>
+        <w:tblBorders>
+          <w:top w:val="single" w:sz="4" w:color="BFBFBF"/>
+          <w:left w:val="single" w:sz="4" w:color="BFBFBF"/>
+          <w:bottom w:val="single" w:sz="4" w:color="BFBFBF"/>
+          <w:right w:val="single" w:sz="4" w:color="BFBFBF"/>
+          <w:insideH w:val="single" w:sz="4" w:color="BFBFBF"/>
+          <w:insideV w:val="single" w:sz="4" w:color="BFBFBF"/>
+        </w:tblBorders>
+      </w:tblPr>
+      <w:tblGrid>
+        <w:gridCol w:w="2640"/>
+        <w:gridCol w:w="2640"/>
+        <w:gridCol w:w="2640"/>
+      </w:tblGrid>
+      <w:tr>
+        <w:trPr>
+          <w:tblHeader w:val="true"/>
+        </w:trPr>
+        <w:tc>
+          <w:tcPr/>
+          <w:p>
+            <w:pPr>
+              <w:pStyle w:val="Compact"/>
+              <w:jc w:val="left"/>
+            </w:pPr>
+            <w:r>
+              <w:rPr>
+                <w:b/>
+                <w:sz w:val="17"/>
+              </w:rPr>
+              <w:t xml:space="preserve">Manual</w:t>
+            </w:r>
+          </w:p>
+        </w:tc>
+        <w:tc>
+          <w:tcPr/>
+          <w:p>
+            <w:pPr>
+              <w:pStyle w:val="Compact"/>
+              <w:jc w:val="left"/>
+            </w:pPr>
+            <w:r>
+              <w:rPr>
+                <w:b/>
+                <w:sz w:val="17"/>
+              </w:rPr>
+              <w:t xml:space="preserve">Use it for</w:t>
+            </w:r>
+          </w:p>
+        </w:tc>
+        <w:tc>
+          <w:tcPr/>
+          <w:p>
+            <w:pPr>
+              <w:pStyle w:val="Compact"/>
+              <w:jc w:val="left"/>
+            </w:pPr>
+            <w:r>
+              <w:rPr>
+                <w:b/>
+                <w:sz w:val="17"/>
+              </w:rPr>
+              <w:t xml:space="preserve">Access</w:t>
+            </w:r>
+          </w:p>
+        </w:tc>
+      </w:tr>
+      <w:tr>
+        <w:tc>
+          <w:tcPr/>
+          <w:p>
+            <w:pPr>
+              <w:pStyle w:val="Compact"/>
+              <w:jc w:val="left"/>
+            </w:pPr>
+            <w:hyperlink r:id="rId81">
+              <w:r>
+                <w:rPr>
+                  <w:rStyle w:val="Hyperlink"/>
+                </w:rPr>
+                <w:t xml:space="preserve">GE GER-3574G, Combined-Cycle Product Line and Performance</w:t>
+              </w:r>
+            </w:hyperlink>
+          </w:p>
+        </w:tc>
+        <w:tc>
+          <w:tcPr/>
+          <w:p>
+            <w:pPr>
+              <w:pStyle w:val="Compact"/>
+              <w:jc w:val="left"/>
+            </w:pPr>
+            <w:r>
+              <w:rPr>
+                <w:sz w:val="17"/>
+              </w:rPr>
+              <w:t xml:space="preserve">1x1, 2x1 and 3x1 configurations and performance.</w:t>
+            </w:r>
+          </w:p>
+        </w:tc>
+        <w:tc>
+          <w:tcPr/>
+          <w:p>
+            <w:pPr>
+              <w:pStyle w:val="Compact"/>
+              <w:jc w:val="left"/>
+            </w:pPr>
+            <w:r>
+              <w:rPr>
+                <w:sz w:val="17"/>
+              </w:rPr>
+              <w:t xml:space="preserve">Free PDF (university copy)</w:t>
+            </w:r>
+          </w:p>
+        </w:tc>
+      </w:tr>
+      <w:tr>
+        <w:tc>
+          <w:tcPr/>
+          <w:p>
+            <w:pPr>
+              <w:pStyle w:val="Compact"/>
+              <w:jc w:val="left"/>
+            </w:pPr>
+            <w:hyperlink r:id="rId82">
+              <w:r>
+                <w:rPr>
+                  <w:rStyle w:val="Hyperlink"/>
+                </w:rPr>
+                <w:t xml:space="preserve">GE GER-3936A, Advanced Technology Combined Cycles</w:t>
+              </w:r>
+            </w:hyperlink>
+          </w:p>
+        </w:tc>
+        <w:tc>
+          <w:tcPr/>
+          <w:p>
+            <w:pPr>
+              <w:pStyle w:val="Compact"/>
+              <w:jc w:val="left"/>
+            </w:pPr>
+            <w:r>
+              <w:rPr>
+                <w:sz w:val="17"/>
+              </w:rPr>
+              <w:t xml:space="preserve">H-class combined-cycle configurations.</w:t>
+            </w:r>
+          </w:p>
+        </w:tc>
+        <w:tc>
+          <w:tcPr/>
+          <w:p>
+            <w:pPr>
+              <w:pStyle w:val="Compact"/>
+              <w:jc w:val="left"/>
+            </w:pPr>
+            <w:r>
+              <w:rPr>
+                <w:sz w:val="17"/>
+              </w:rPr>
+              <w:t xml:space="preserve">Free PDF (university copy)</w:t>
+            </w:r>
+          </w:p>
+        </w:tc>
+      </w:tr>
+      <w:tr>
+        <w:tc>
+          <w:tcPr/>
+          <w:p>
+            <w:pPr>
+              <w:pStyle w:val="Compact"/>
+              <w:jc w:val="left"/>
+            </w:pPr>
+            <w:hyperlink r:id="rId83">
+              <w:r>
+                <w:rPr>
+                  <w:rStyle w:val="Hyperlink"/>
+                </w:rPr>
+                <w:t xml:space="preserve">US Army TM 5-811-6, Electric Power Plant Design (1984)</w:t>
+              </w:r>
+            </w:hyperlink>
+          </w:p>
+        </w:tc>
+        <w:tc>
+          <w:tcPr/>
+          <w:p>
+            <w:pPr>
+              <w:pStyle w:val="Compact"/>
+              <w:jc w:val="left"/>
+            </w:pPr>
+            <w:r>
+              <w:rPr>
+                <w:sz w:val="17"/>
+              </w:rPr>
+              <w:t xml:space="preserve">Public-domain power plant design, including electrical systems.</w:t>
+            </w:r>
+          </w:p>
+        </w:tc>
+        <w:tc>
+          <w:tcPr/>
+          <w:p>
+            <w:pPr>
+              <w:pStyle w:val="Compact"/>
+              <w:jc w:val="left"/>
+            </w:pPr>
+            <w:r>
+              <w:rPr>
+                <w:sz w:val="17"/>
+              </w:rPr>
+              <w:t xml:space="preserve">Free PDF</w:t>
+            </w:r>
+          </w:p>
+        </w:tc>
+      </w:tr>
+      <w:tr>
+        <w:tc>
+          <w:tcPr/>
+          <w:p>
+            <w:pPr>
+              <w:pStyle w:val="Compact"/>
+              <w:jc w:val="left"/>
+            </w:pPr>
+            <w:hyperlink r:id="rId84">
+              <w:r>
+                <w:rPr>
+                  <w:rStyle w:val="Hyperlink"/>
+                </w:rPr>
+                <w:t xml:space="preserve">USACE EM 1110-2-3006, Hydroelectric Power Plants: Electrical Design (1994)</w:t>
+              </w:r>
+            </w:hyperlink>
+          </w:p>
+        </w:tc>
+        <w:tc>
+          <w:tcPr/>
+          <w:p>
+            <w:pPr>
+              <w:pStyle w:val="Compact"/>
+              <w:jc w:val="left"/>
+            </w:pPr>
+            <w:r>
+              <w:rPr>
+                <w:sz w:val="17"/>
+              </w:rPr>
+              <w:t xml:space="preserve">Generator, switching arrangement, fault current and cable methods; hydro but transferable.</w:t>
+            </w:r>
+          </w:p>
+        </w:tc>
+        <w:tc>
+          <w:tcPr/>
+          <w:p>
+            <w:pPr>
+              <w:pStyle w:val="Compact"/>
+              <w:jc w:val="left"/>
+            </w:pPr>
+            <w:r>
+              <w:rPr>
+                <w:sz w:val="17"/>
+              </w:rPr>
+              <w:t xml:space="preserve">Free PDF</w:t>
+            </w:r>
+          </w:p>
+        </w:tc>
+      </w:tr>
+      <w:tr>
+        <w:tc>
+          <w:tcPr/>
+          <w:p>
+            <w:pPr>
+              <w:pStyle w:val="Compact"/>
+              <w:jc w:val="left"/>
+            </w:pPr>
+            <w:r>
+              <w:rPr>
+                <w:sz w:val="17"/>
+              </w:rPr>
+              <w:t xml:space="preserve">Kehlhofer et al., Combined-Cycle Gas &amp; Steam Turbine Power Plants, 3rd ed. (PennWell, 2009), ISBN 9781593701680</w:t>
+            </w:r>
+          </w:p>
+        </w:tc>
+        <w:tc>
+          <w:tcPr/>
+          <w:p>
+            <w:pPr>
+              <w:pStyle w:val="Compact"/>
+              <w:jc w:val="left"/>
+            </w:pPr>
+            <w:r>
+              <w:rPr>
+                <w:sz w:val="17"/>
+              </w:rPr>
+              <w:t xml:space="preserve">Standard combined-cycle design text: configurations, thermodynamics, economics.</w:t>
+            </w:r>
+          </w:p>
+        </w:tc>
+        <w:tc>
+          <w:tcPr/>
+          <w:p>
+            <w:pPr>
+              <w:pStyle w:val="Compact"/>
+              <w:jc w:val="left"/>
+            </w:pPr>
+            <w:r>
+              <w:rPr>
+                <w:sz w:val="17"/>
+              </w:rPr>
+              <w:t xml:space="preserve">Book</w:t>
+            </w:r>
+          </w:p>
+        </w:tc>
+      </w:tr>
+      <w:tr>
+        <w:tc>
+          <w:tcPr/>
+          <w:p>
+            <w:pPr>
+              <w:pStyle w:val="Compact"/>
+              <w:jc w:val="left"/>
+            </w:pPr>
+            <w:hyperlink r:id="rId85">
+              <w:r>
+                <w:rPr>
+                  <w:rStyle w:val="Hyperlink"/>
+                </w:rPr>
+                <w:t xml:space="preserve">Boyce, Handbook for Cogeneration and Combined Cycle Power Plants, 2nd ed. (ASME, 2010)</w:t>
+              </w:r>
+            </w:hyperlink>
+          </w:p>
+        </w:tc>
+        <w:tc>
+          <w:tcPr/>
+          <w:p>
+            <w:pPr>
+              <w:pStyle w:val="Compact"/>
+              <w:jc w:val="left"/>
+            </w:pPr>
+            <w:r>
+              <w:rPr>
+                <w:sz w:val="17"/>
+              </w:rPr>
+              <w:t xml:space="preserve">Includes generators, motors and switchgear.</w:t>
+            </w:r>
+          </w:p>
+        </w:tc>
+        <w:tc>
+          <w:tcPr/>
+          <w:p>
+            <w:pPr>
+              <w:pStyle w:val="Compact"/>
+              <w:jc w:val="left"/>
+            </w:pPr>
+            <w:r>
+              <w:rPr>
+                <w:sz w:val="17"/>
+              </w:rPr>
+              <w:t xml:space="preserve">Book</w:t>
+            </w:r>
+          </w:p>
+        </w:tc>
+      </w:tr>
+      <w:tr>
+        <w:tc>
+          <w:tcPr/>
+          <w:p>
+            <w:pPr>
+              <w:pStyle w:val="Compact"/>
+              <w:jc w:val="left"/>
+            </w:pPr>
+            <w:hyperlink r:id="rId86">
+              <w:r>
+                <w:rPr>
+                  <w:rStyle w:val="Hyperlink"/>
+                </w:rPr>
+                <w:t xml:space="preserve">Stuart, Modern Power Station Practice, Vol. 4: Electrical</w:t>
+              </w:r>
+            </w:hyperlink>
+          </w:p>
+        </w:tc>
+        <w:tc>
+          <w:tcPr/>
+          <w:p>
+            <w:pPr>
+              <w:pStyle w:val="Compact"/>
+              <w:jc w:val="left"/>
+            </w:pPr>
+            <w:r>
+              <w:rPr>
+                <w:sz w:val="17"/>
+              </w:rPr>
+              <w:t xml:space="preserve">Auxiliary system design, switchgear, motors (1971).</w:t>
+            </w:r>
+          </w:p>
+        </w:tc>
+        <w:tc>
+          <w:tcPr/>
+          <w:p>
+            <w:pPr>
+              <w:pStyle w:val="Compact"/>
+              <w:jc w:val="left"/>
+            </w:pPr>
+            <w:r>
+              <w:rPr>
+                <w:sz w:val="17"/>
+              </w:rPr>
+              <w:t xml:space="preserve">Book</w:t>
+            </w:r>
+          </w:p>
+        </w:tc>
+      </w:tr>
+      <w:tr>
+        <w:tc>
+          <w:tcPr/>
+          <w:p>
+            <w:pPr>
+              <w:pStyle w:val="Compact"/>
+              <w:jc w:val="left"/>
+            </w:pPr>
+            <w:hyperlink r:id="rId87">
+              <w:r>
+                <w:rPr>
+                  <w:rStyle w:val="Hyperlink"/>
+                </w:rPr>
+                <w:t xml:space="preserve">TCE case study: generator step-up transformer configuration</w:t>
+              </w:r>
+            </w:hyperlink>
+          </w:p>
+        </w:tc>
+        <w:tc>
+          <w:tcPr/>
+          <w:p>
+            <w:pPr>
+              <w:pStyle w:val="Compact"/>
+              <w:jc w:val="left"/>
+            </w:pPr>
+            <w:r>
+              <w:rPr>
+                <w:sz w:val="17"/>
+              </w:rPr>
+              <w:t xml:space="preserve">One step-up transformer per generator; rating across site temperature range.</w:t>
+            </w:r>
+          </w:p>
+        </w:tc>
+        <w:tc>
+          <w:tcPr/>
+          <w:p>
+            <w:pPr>
+              <w:pStyle w:val="Compact"/>
+              <w:jc w:val="left"/>
+            </w:pPr>
+            <w:r>
+              <w:rPr>
+                <w:sz w:val="17"/>
+              </w:rPr>
+              <w:t xml:space="preserve">Web page</w:t>
+            </w:r>
+          </w:p>
+        </w:tc>
+      </w:tr>
+      <w:tr>
+        <w:tc>
+          <w:tcPr/>
+          <w:p>
+            <w:pPr>
+              <w:pStyle w:val="Compact"/>
+              <w:jc w:val="left"/>
+            </w:pPr>
+            <w:hyperlink r:id="rId88">
+              <w:r>
+                <w:rPr>
+                  <w:rStyle w:val="Hyperlink"/>
+                </w:rPr>
+                <w:t xml:space="preserve">JEA combined cycle procurement, Addendum 2</w:t>
+              </w:r>
+            </w:hyperlink>
+          </w:p>
+        </w:tc>
+        <w:tc>
+          <w:tcPr/>
+          <w:p>
+            <w:pPr>
+              <w:pStyle w:val="Compact"/>
+              <w:jc w:val="left"/>
+            </w:pPr>
+            <w:r>
+              <w:rPr>
+                <w:sz w:val="17"/>
+              </w:rPr>
+              <w:t xml:space="preserve">Unit auxiliary transformers to step-up duty (IEEE C57.116).</w:t>
+            </w:r>
+          </w:p>
+        </w:tc>
+        <w:tc>
+          <w:tcPr/>
+          <w:p>
+            <w:pPr>
+              <w:pStyle w:val="Compact"/>
+              <w:jc w:val="left"/>
+            </w:pPr>
+            <w:r>
+              <w:rPr>
+                <w:sz w:val="17"/>
+              </w:rPr>
+              <w:t xml:space="preserve">Web page</w:t>
+            </w:r>
+          </w:p>
+        </w:tc>
+      </w:tr>
+      <w:tr>
+        <w:tc>
+          <w:tcPr/>
+          <w:p>
+            <w:pPr>
+              <w:pStyle w:val="Compact"/>
+              <w:jc w:val="left"/>
+            </w:pPr>
+            <w:hyperlink r:id="rId89">
+              <w:r>
+                <w:rPr>
+                  <w:rStyle w:val="Hyperlink"/>
+                </w:rPr>
+                <w:t xml:space="preserve">Duro Felguera / Comillas combined cycle studies</w:t>
+              </w:r>
+            </w:hyperlink>
+          </w:p>
+        </w:tc>
+        <w:tc>
+          <w:tcPr/>
+          <w:p>
+            <w:pPr>
+              <w:pStyle w:val="Compact"/>
+              <w:jc w:val="left"/>
+            </w:pPr>
+            <w:r>
+              <w:rPr>
+                <w:sz w:val="17"/>
+              </w:rPr>
+              <w:t xml:space="preserve">Step-up transformer taps, auxiliary load flow, short circuit, motor starting.</w:t>
+            </w:r>
+          </w:p>
+        </w:tc>
+        <w:tc>
+          <w:tcPr/>
+          <w:p>
+            <w:pPr>
+              <w:pStyle w:val="Compact"/>
+              <w:jc w:val="left"/>
+            </w:pPr>
+            <w:r>
+              <w:rPr>
+                <w:sz w:val="17"/>
+              </w:rPr>
+              <w:t xml:space="preserve">Web page</w:t>
+            </w:r>
+          </w:p>
+        </w:tc>
+      </w:tr>
+    </w:tbl>
+    <w:p>
+      <w:pPr>
+        <w:pStyle w:val="BodyText"/>
+      </w:pPr>
+      <w:r>
+        <w:t xml:space="preserve">No Prysmian, General Cable, Nexans, Kerite, Rome Cable, Black &amp; Veatch, Burns &amp; McDonnell or EPRI design manual was found; most are proprietary.</w:t>
+      </w:r>
+    </w:p>
+    <w:bookmarkEnd w:id="90"/>
+    <w:bookmarkStart w:id="91" w:name="sources"/>
     <w:p>
       <w:pPr>
         <w:pStyle w:val="Heading2"/>
@@ -6940,11 +7979,11 @@
         <w:t xml:space="preserve"> </w:t>
       </w:r>
       <w:r>
-        <w:t xml:space="preserve">see the table in section 11.</w:t>
+        <w:t xml:space="preserve">see the table in section 11. Power cable and combined cycle design manuals: see the tables in section 13.</w:t>
       </w:r>
     </w:p>
-    <w:bookmarkEnd w:id="75"/>
-    <w:bookmarkEnd w:id="76"/>
+    <w:bookmarkEnd w:id="91"/>
+    <w:bookmarkEnd w:id="92"/>
     <w:sectPr>
       <w:pgMar w:left="1008" w:right="1008" w:top="1008" w:bottom="1008"/>
     </w:sectPr>

</xml_diff>